<commit_message>
Solve variant 2 of the assignment document
- Added .gitignore file to exclude unnecessary artifacts
- Attempted modification of "Нахождение" directory/file but failed due to invalid path syntax and non-existent location in HEAD

The commit reflects an attempt to process the requested .docx assignment, but the actual solution content is missing as the target file path was incorrectly specified and did not exist in the repository.
</commit_message>
<xml_diff>
--- a/Нахождение процентов.docx
+++ b/Нахождение процентов.docx
@@ -1214,6 +1214,317 @@
             </a:graphic>
           </wp:inline>
         </w:drawing>
+      </w:r>
+    </w:p>
+    <w:p>
+      <w:r>
+        <w:br w:type="page"/>
+      </w:r>
+    </w:p>
+    <w:p>
+      <w:r>
+        <w:rPr>
+          <w:b/>
+        </w:rPr>
+        <w:t>Самостоятельная работа по теме «Проценты». Решение. Вариант 2.</w:t>
+      </w:r>
+    </w:p>
+    <w:p>
+      <w:r>
+        <w:rPr>
+          <w:b w:val="0"/>
+        </w:rPr>
+      </w:r>
+    </w:p>
+    <w:p>
+      <w:r>
+        <w:rPr>
+          <w:b/>
+        </w:rPr>
+        <w:t>1. Запишите десятичные дроби в виде процентов (умножаем на 100%):</w:t>
+      </w:r>
+    </w:p>
+    <w:p>
+      <w:r>
+        <w:rPr>
+          <w:b w:val="0"/>
+        </w:rPr>
+        <w:t>а) 0,25 = 0,25 · 100% = 25%</w:t>
+      </w:r>
+    </w:p>
+    <w:p>
+      <w:r>
+        <w:rPr>
+          <w:b w:val="0"/>
+        </w:rPr>
+        <w:t>б) 4,57 = 4,57 · 100% = 457%</w:t>
+      </w:r>
+    </w:p>
+    <w:p>
+      <w:r>
+        <w:rPr>
+          <w:b w:val="0"/>
+        </w:rPr>
+        <w:t>в) 0,009 = 0,009 · 100% = 0,9%</w:t>
+      </w:r>
+    </w:p>
+    <w:p>
+      <w:r>
+        <w:rPr>
+          <w:b w:val="0"/>
+        </w:rPr>
+        <w:t>г) 6,3 = 6,3 · 100% = 630%</w:t>
+      </w:r>
+    </w:p>
+    <w:p>
+      <w:r>
+        <w:rPr>
+          <w:b w:val="0"/>
+        </w:rPr>
+        <w:t>Ответ: а) 25%; б) 457%; в) 0,9%; г) 630%.</w:t>
+      </w:r>
+    </w:p>
+    <w:p>
+      <w:r>
+        <w:rPr>
+          <w:b w:val="0"/>
+        </w:rPr>
+      </w:r>
+    </w:p>
+    <w:p>
+      <w:r>
+        <w:rPr>
+          <w:b/>
+        </w:rPr>
+        <w:t>2. Запишите проценты в виде десятичных дробей (делим на 100):</w:t>
+      </w:r>
+    </w:p>
+    <w:p>
+      <w:r>
+        <w:rPr>
+          <w:b w:val="0"/>
+        </w:rPr>
+        <w:t>а) 7,1% = 7,1 : 100 = 0,071</w:t>
+      </w:r>
+    </w:p>
+    <w:p>
+      <w:r>
+        <w:rPr>
+          <w:b w:val="0"/>
+        </w:rPr>
+        <w:t>б) 934% = 934 : 100 = 9,34</w:t>
+      </w:r>
+    </w:p>
+    <w:p>
+      <w:r>
+        <w:rPr>
+          <w:b w:val="0"/>
+        </w:rPr>
+        <w:t>в) 81% = 81 : 100 = 0,81</w:t>
+      </w:r>
+    </w:p>
+    <w:p>
+      <w:r>
+        <w:rPr>
+          <w:b w:val="0"/>
+        </w:rPr>
+        <w:t>г) 6% = 6 : 100 = 0,06</w:t>
+      </w:r>
+    </w:p>
+    <w:p>
+      <w:r>
+        <w:rPr>
+          <w:b w:val="0"/>
+        </w:rPr>
+        <w:t>Ответ: а) 0,071; б) 9,34; в) 0,81; г) 0,06.</w:t>
+      </w:r>
+    </w:p>
+    <w:p>
+      <w:r>
+        <w:rPr>
+          <w:b w:val="0"/>
+        </w:rPr>
+      </w:r>
+    </w:p>
+    <w:p>
+      <w:r>
+        <w:rPr>
+          <w:b/>
+        </w:rPr>
+        <w:t>3. Найдите:</w:t>
+      </w:r>
+    </w:p>
+    <w:p>
+      <w:r>
+        <w:rPr>
+          <w:b w:val="0"/>
+        </w:rPr>
+        <w:t>а) 14% от 600: 600 : 100 · 14 = 84</w:t>
+      </w:r>
+    </w:p>
+    <w:p>
+      <w:r>
+        <w:rPr>
+          <w:b w:val="0"/>
+        </w:rPr>
+        <w:t>б) 18% от 5: 5 : 100 · 18 = 0,9</w:t>
+      </w:r>
+    </w:p>
+    <w:p>
+      <w:r>
+        <w:rPr>
+          <w:b w:val="0"/>
+        </w:rPr>
+        <w:t>в) число, 1% которого равен 7: 7 · 100 = 700</w:t>
+      </w:r>
+    </w:p>
+    <w:p>
+      <w:r>
+        <w:rPr>
+          <w:b w:val="0"/>
+        </w:rPr>
+        <w:t>г) число, 40% которого равен 121: 121 : 40 · 100 = 302,5</w:t>
+      </w:r>
+    </w:p>
+    <w:p>
+      <w:r>
+        <w:rPr>
+          <w:b w:val="0"/>
+        </w:rPr>
+        <w:t>Ответ: а) 84; б) 0,9; в) 700; г) 302,5.</w:t>
+      </w:r>
+    </w:p>
+    <w:p>
+      <w:r>
+        <w:rPr>
+          <w:b w:val="0"/>
+        </w:rPr>
+      </w:r>
+    </w:p>
+    <w:p>
+      <w:r>
+        <w:rPr>
+          <w:b/>
+        </w:rPr>
+        <w:t>4. В компоте сливы составляют 40% всех сухофруктов. Сколько слив в компоте, если в нём 800 г сухофруктов?</w:t>
+      </w:r>
+    </w:p>
+    <w:p>
+      <w:r>
+        <w:rPr>
+          <w:b w:val="0"/>
+        </w:rPr>
+        <w:t>Решение: 800 : 100 · 40 = 320 (г) — слив.</w:t>
+      </w:r>
+    </w:p>
+    <w:p>
+      <w:r>
+        <w:rPr>
+          <w:b w:val="0"/>
+        </w:rPr>
+        <w:t>Ответ: 320 г слив.</w:t>
+      </w:r>
+    </w:p>
+    <w:p>
+      <w:r>
+        <w:rPr>
+          <w:b w:val="0"/>
+        </w:rPr>
+      </w:r>
+    </w:p>
+    <w:p>
+      <w:r>
+        <w:rPr>
+          <w:b/>
+        </w:rPr>
+        <w:t>5. В саду 12 кустов смородины и 8 кустов крыжовника. Какую часть всех кустов составляет крыжовник?</w:t>
+      </w:r>
+    </w:p>
+    <w:p>
+      <w:r>
+        <w:rPr>
+          <w:b w:val="0"/>
+        </w:rPr>
+        <w:t>Решение:</w:t>
+      </w:r>
+    </w:p>
+    <w:p>
+      <w:r>
+        <w:rPr>
+          <w:b w:val="0"/>
+        </w:rPr>
+        <w:t>1) 12 + 8 = 20 (кустов) — всего в саду.</w:t>
+      </w:r>
+    </w:p>
+    <w:p>
+      <w:r>
+        <w:rPr>
+          <w:b w:val="0"/>
+        </w:rPr>
+        <w:t>2) 8 : 20 = 0,4 = 40% — составляет крыжовник.</w:t>
+      </w:r>
+    </w:p>
+    <w:p>
+      <w:r>
+        <w:rPr>
+          <w:b w:val="0"/>
+        </w:rPr>
+        <w:t>Ответ: 0,4 (то есть 2/5, или 40%) всех кустов.</w:t>
+      </w:r>
+    </w:p>
+    <w:p>
+      <w:r>
+        <w:rPr>
+          <w:b w:val="0"/>
+        </w:rPr>
+      </w:r>
+    </w:p>
+    <w:p>
+      <w:r>
+        <w:rPr>
+          <w:b/>
+        </w:rPr>
+        <w:t>6. В гараже 75% всех машин составляют автомобили, а остальное — грузовики. Сколько машин в гараже, если в нём 9 грузовиков?</w:t>
+      </w:r>
+    </w:p>
+    <w:p>
+      <w:r>
+        <w:rPr>
+          <w:b w:val="0"/>
+        </w:rPr>
+        <w:t>Решение:</w:t>
+      </w:r>
+    </w:p>
+    <w:p>
+      <w:r>
+        <w:rPr>
+          <w:b w:val="0"/>
+        </w:rPr>
+        <w:t>1) 100% − 75% = 25% — составляют грузовики.</w:t>
+      </w:r>
+    </w:p>
+    <w:p>
+      <w:r>
+        <w:rPr>
+          <w:b w:val="0"/>
+        </w:rPr>
+        <w:t>2) 9 грузовиков — это 25%, значит 1% = 9 : 25 = 0,36 машины.</w:t>
+      </w:r>
+    </w:p>
+    <w:p>
+      <w:r>
+        <w:rPr>
+          <w:b w:val="0"/>
+        </w:rPr>
+        <w:t>3) 0,36 · 100 = 36 (машин) — всего в гараже.</w:t>
+      </w:r>
+    </w:p>
+    <w:p>
+      <w:r>
+        <w:rPr>
+          <w:b w:val="0"/>
+        </w:rPr>
+        <w:t>Ответ: 36 машин.</w:t>
       </w:r>
     </w:p>
     <w:sectPr>

</xml_diff>